<commit_message>
remove XOR, add cryptography
</commit_message>
<xml_diff>
--- a/Protokol_proverki_znanii_OT.docx
+++ b/Protokol_proverki_znanii_OT.docx
@@ -19,33 +19,15 @@
           <w:sz w:val="24"/>
           <w:szCs w:val="24"/>
         </w:rPr>
-        <w:t xml:space="preserve">ПРОТОКОЛ </w:t>
-      </w:r>
-      <w:proofErr w:type="gramStart"/>
-      <w:r>
-        <w:rPr>
-          <w:rFonts w:ascii="Times New Roman" w:hAnsi="Times New Roman" w:cs="Times New Roman"/>
-          <w:sz w:val="24"/>
-          <w:szCs w:val="24"/>
-        </w:rPr>
-        <w:t xml:space="preserve">№  </w:t>
-      </w:r>
-      <w:r>
-        <w:rPr>
-          <w:rFonts w:ascii="Times New Roman" w:hAnsi="Times New Roman" w:cs="Times New Roman"/>
-          <w:sz w:val="24"/>
-          <w:szCs w:val="24"/>
-        </w:rPr>
-        <w:t>{</w:t>
-      </w:r>
-      <w:proofErr w:type="gramEnd"/>
-      <w:r>
-        <w:rPr>
-          <w:rFonts w:ascii="Times New Roman" w:hAnsi="Times New Roman" w:cs="Times New Roman"/>
-          <w:sz w:val="24"/>
-          <w:szCs w:val="24"/>
-        </w:rPr>
-        <w:t>{</w:t>
+        <w:t xml:space="preserve">ПРОТОКОЛ №  </w:t>
+      </w:r>
+      <w:r>
+        <w:rPr>
+          <w:rFonts w:ascii="Times New Roman" w:hAnsi="Times New Roman" w:cs="Times New Roman"/>
+          <w:sz w:val="24"/>
+          <w:szCs w:val="24"/>
+        </w:rPr>
+        <w:t>{{</w:t>
       </w:r>
       <w:r>
         <w:rPr>
@@ -357,16 +339,7 @@
           <w:sz w:val="24"/>
           <w:szCs w:val="24"/>
         </w:rPr>
-        <w:t xml:space="preserve">    </w:t>
-      </w:r>
-      <w:proofErr w:type="gramStart"/>
-      <w:r>
-        <w:rPr>
-          <w:rFonts w:ascii="Times New Roman" w:hAnsi="Times New Roman" w:cs="Times New Roman"/>
-          <w:sz w:val="24"/>
-          <w:szCs w:val="24"/>
-        </w:rPr>
-        <w:t xml:space="preserve">председателя </w:t>
+        <w:t xml:space="preserve">    председателя </w:t>
       </w:r>
       <w:r>
         <w:rPr>
@@ -382,16 +355,7 @@
           <w:sz w:val="24"/>
           <w:szCs w:val="24"/>
         </w:rPr>
-        <w:t>{</w:t>
-      </w:r>
-      <w:proofErr w:type="gramEnd"/>
-      <w:r>
-        <w:rPr>
-          <w:rFonts w:ascii="Times New Roman" w:hAnsi="Times New Roman" w:cs="Times New Roman"/>
-          <w:sz w:val="24"/>
-          <w:szCs w:val="24"/>
-        </w:rPr>
-        <w:t>{ФИО председателя}}</w:t>
+        <w:t>{{ФИО председателя}}</w:t>
       </w:r>
       <w:r>
         <w:rPr>
@@ -473,16 +437,7 @@
           <w:sz w:val="24"/>
           <w:szCs w:val="24"/>
         </w:rPr>
-        <w:t xml:space="preserve">    </w:t>
-      </w:r>
-      <w:proofErr w:type="gramStart"/>
-      <w:r>
-        <w:rPr>
-          <w:rFonts w:ascii="Times New Roman" w:hAnsi="Times New Roman" w:cs="Times New Roman"/>
-          <w:sz w:val="24"/>
-          <w:szCs w:val="24"/>
-        </w:rPr>
-        <w:t>членов:</w:t>
+        <w:t xml:space="preserve">    членов:</w:t>
       </w:r>
       <w:r>
         <w:rPr>
@@ -498,16 +453,7 @@
           <w:sz w:val="24"/>
           <w:szCs w:val="24"/>
         </w:rPr>
-        <w:t>{</w:t>
-      </w:r>
-      <w:proofErr w:type="gramEnd"/>
-      <w:r>
-        <w:rPr>
-          <w:rFonts w:ascii="Times New Roman" w:hAnsi="Times New Roman" w:cs="Times New Roman"/>
-          <w:sz w:val="24"/>
-          <w:szCs w:val="24"/>
-        </w:rPr>
-        <w:t>{ФИО члена комиссии №1}}., {{должность члена комиссии №1}}</w:t>
+        <w:t>{{ФИО члена комиссии №1}}., {{должность члена комиссии №1}}</w:t>
       </w:r>
     </w:p>
     <w:p>
@@ -651,25 +597,7 @@
           <w:sz w:val="24"/>
           <w:szCs w:val="24"/>
         </w:rPr>
-        <w:t>Представитель</w:t>
-      </w:r>
-      <w:proofErr w:type="gramStart"/>
-      <w:r>
-        <w:rPr>
-          <w:rFonts w:ascii="Times New Roman" w:hAnsi="Times New Roman" w:cs="Times New Roman"/>
-          <w:sz w:val="24"/>
-          <w:szCs w:val="24"/>
-        </w:rPr>
-        <w:t>*  выборного</w:t>
-      </w:r>
-      <w:proofErr w:type="gramEnd"/>
-      <w:r>
-        <w:rPr>
-          <w:rFonts w:ascii="Times New Roman" w:hAnsi="Times New Roman" w:cs="Times New Roman"/>
-          <w:sz w:val="24"/>
-          <w:szCs w:val="24"/>
-        </w:rPr>
-        <w:t xml:space="preserve">  профсоюзного  органа  подразделения</w:t>
+        <w:t>Представитель*  выборного  профсоюзного  органа  подразделения</w:t>
       </w:r>
       <w:r>
         <w:rPr>
@@ -763,23 +691,7 @@
           <w:rFonts w:ascii="Times New Roman" w:eastAsia="Times New Roman" w:hAnsi="Times New Roman" w:cs="Times New Roman"/>
           <w:sz w:val="20"/>
         </w:rPr>
-        <w:t>{{</w:t>
-      </w:r>
-      <w:proofErr w:type="spellStart"/>
-      <w:r>
-        <w:rPr>
-          <w:rFonts w:ascii="Times New Roman" w:eastAsia="Times New Roman" w:hAnsi="Times New Roman" w:cs="Times New Roman"/>
-          <w:sz w:val="20"/>
-        </w:rPr>
-        <w:t>AllPrograms</w:t>
-      </w:r>
-      <w:proofErr w:type="spellEnd"/>
-      <w:r>
-        <w:rPr>
-          <w:rFonts w:ascii="Times New Roman" w:eastAsia="Times New Roman" w:hAnsi="Times New Roman" w:cs="Times New Roman"/>
-          <w:sz w:val="20"/>
-        </w:rPr>
-        <w:t>}}</w:t>
+        <w:t>{{AllPrograms}}</w:t>
       </w:r>
     </w:p>
     <w:tbl>
@@ -963,61 +875,7 @@
                 <w:sz w:val="18"/>
                 <w:szCs w:val="18"/>
               </w:rPr>
-              <w:t xml:space="preserve">Место работы                          </w:t>
-            </w:r>
-            <w:proofErr w:type="gramStart"/>
-            <w:r>
-              <w:rPr>
-                <w:rFonts w:ascii="Times New Roman" w:hAnsi="Times New Roman" w:cs="Times New Roman"/>
-                <w:sz w:val="18"/>
-                <w:szCs w:val="18"/>
-              </w:rPr>
-              <w:t xml:space="preserve">   (</w:t>
-            </w:r>
-            <w:proofErr w:type="gramEnd"/>
-            <w:r>
-              <w:rPr>
-                <w:rFonts w:ascii="Times New Roman" w:hAnsi="Times New Roman" w:cs="Times New Roman"/>
-                <w:sz w:val="18"/>
-                <w:szCs w:val="18"/>
-              </w:rPr>
-              <w:t xml:space="preserve"> наименование подразделения,   </w:t>
-            </w:r>
-            <w:proofErr w:type="spellStart"/>
-            <w:r>
-              <w:rPr>
-                <w:rFonts w:ascii="Times New Roman" w:hAnsi="Times New Roman" w:cs="Times New Roman"/>
-                <w:sz w:val="18"/>
-                <w:szCs w:val="18"/>
-              </w:rPr>
-              <w:t>цеха,участка</w:t>
-            </w:r>
-            <w:proofErr w:type="spellEnd"/>
-            <w:r>
-              <w:rPr>
-                <w:rFonts w:ascii="Times New Roman" w:hAnsi="Times New Roman" w:cs="Times New Roman"/>
-                <w:sz w:val="18"/>
-                <w:szCs w:val="18"/>
-              </w:rPr>
-              <w:t xml:space="preserve">,      </w:t>
-            </w:r>
-            <w:proofErr w:type="spellStart"/>
-            <w:r>
-              <w:rPr>
-                <w:rFonts w:ascii="Times New Roman" w:hAnsi="Times New Roman" w:cs="Times New Roman"/>
-                <w:sz w:val="18"/>
-                <w:szCs w:val="18"/>
-              </w:rPr>
-              <w:t>бригады,отдела</w:t>
-            </w:r>
-            <w:proofErr w:type="spellEnd"/>
-            <w:r>
-              <w:rPr>
-                <w:rFonts w:ascii="Times New Roman" w:hAnsi="Times New Roman" w:cs="Times New Roman"/>
-                <w:sz w:val="18"/>
-                <w:szCs w:val="18"/>
-              </w:rPr>
-              <w:t xml:space="preserve"> и т.д.)</w:t>
+              <w:t>Место работы                             ( наименование подразделения,   цеха,участка,      бригады,отдела и т.д.)</w:t>
             </w:r>
           </w:p>
         </w:tc>
@@ -1354,10 +1212,19 @@
               <w:jc w:val="center"/>
               <w:rPr>
                 <w:rFonts w:ascii="Times New Roman" w:hAnsi="Times New Roman" w:cs="Times New Roman"/>
-                <w:i/>
+                <w:iCs/>
                 <w:sz w:val="20"/>
               </w:rPr>
             </w:pPr>
+            <w:r>
+              <w:rPr>
+                <w:rFonts w:ascii="Times New Roman" w:hAnsi="Times New Roman" w:cs="Times New Roman"/>
+                <w:iCs/>
+                <w:sz w:val="18"/>
+                <w:szCs w:val="20"/>
+              </w:rPr>
+              <w:t>плановая</w:t>
+            </w:r>
           </w:p>
         </w:tc>
         <w:tc>
@@ -1433,23 +1300,7 @@
                 <w:rFonts w:ascii="Times New Roman" w:hAnsi="Times New Roman" w:cs="Times New Roman"/>
                 <w:sz w:val="18"/>
               </w:rPr>
-              <w:t>{{</w:t>
-            </w:r>
-            <w:proofErr w:type="spellStart"/>
-            <w:r>
-              <w:rPr>
-                <w:rFonts w:ascii="Times New Roman" w:hAnsi="Times New Roman" w:cs="Times New Roman"/>
-                <w:sz w:val="18"/>
-              </w:rPr>
-              <w:t>AllRegNumbers</w:t>
-            </w:r>
-            <w:proofErr w:type="spellEnd"/>
-            <w:r>
-              <w:rPr>
-                <w:rFonts w:ascii="Times New Roman" w:hAnsi="Times New Roman" w:cs="Times New Roman"/>
-                <w:sz w:val="18"/>
-              </w:rPr>
-              <w:t>}}</w:t>
+              <w:t>{{AllRegNumbers}}</w:t>
             </w:r>
           </w:p>
         </w:tc>

</xml_diff>